<commit_message>
fix(chat): route local tools automatically
Source-Commit: cc293978da7181c38c8f34f691743cdbf0a28152
</commit_message>
<xml_diff>
--- a/apps/web/public/assets/samples/artifacts/docs/personal-company-copy.docx
+++ b/apps/web/public/assets/samples/artifacts/docs/personal-company-copy.docx
@@ -4,35 +4,71 @@
   <w:body>
     <w:p>
       <w:pPr>
-        <w:jc w:val="left"/>
+        <w:spacing w:after="320"/>
+        <w:pBdr>
+          <w:bottom w:val="single" w:sz="12" w:space="4" w:color="0F766E"/>
+        </w:pBdr>
       </w:pPr>
       <w:r>
         <w:rPr>
+          <w:rFonts w:ascii="Arial" w:hAnsi="Arial"/>
           <w:b/>
           <w:color w:val="0F766E"/>
-          <w:sz w:val="48"/>
+          <w:sz w:val="18"/>
         </w:rPr>
-        <w:t>个人咨询公司网站文案包</w:t>
+        <w:t>INDEPENDENT CONSULTING / COPY SYSTEM 01</w:t>
       </w:r>
     </w:p>
     <w:p>
+      <w:pPr>
+        <w:pStyle w:val="Title"/>
+      </w:pPr>
       <w:r>
-        <w:rPr>
-          <w:b w:val="0"/>
-          <w:color w:val="64748B"/>
-          <w:sz w:val="22"/>
-        </w:rPr>
-        <w:t>适合 AI 工作流顾问、效率顾问、个人服务公司的首屏、服务页和转化文案。</w:t>
+        <w:t>A Clearer Way to Run Your Work</w:t>
       </w:r>
     </w:p>
     <w:p>
+      <w:pPr>
+        <w:spacing w:after="440"/>
+      </w:pPr>
       <w:r>
         <w:rPr>
+          <w:rFonts w:ascii="Arial" w:hAnsi="Arial"/>
+          <w:color w:val="64748B"/>
+          <w:sz w:val="28"/>
+        </w:rPr>
+        <w:t>Website copy for an independent consultant who turns tangled projects into calm, executable systems.</w:t>
+      </w:r>
+    </w:p>
+    <w:p>
+      <w:pPr>
+        <w:spacing w:before="140" w:after="260"/>
+        <w:ind w:left="259" w:right="259"/>
+        <w:shd w:fill="E8F5F2"/>
+      </w:pPr>
+      <w:r>
+        <w:rPr>
+          <w:rFonts w:ascii="Arial" w:hAnsi="Arial"/>
           <w:b/>
-          <w:color w:val="111827"/>
-          <w:sz w:val="30"/>
+          <w:color w:val="0F766E"/>
+          <w:sz w:val="21"/>
         </w:rPr>
-        <w:t>定位</w:t>
+        <w:t xml:space="preserve">POSITIONING  </w:t>
+      </w:r>
+      <w:r>
+        <w:rPr>
+          <w:rFonts w:ascii="Arial" w:hAnsi="Arial"/>
+          <w:sz w:val="21"/>
+        </w:rPr>
+        <w:t>Practical operating design for freelancers and small-team leads who need less friction, not more software.</w:t>
+      </w:r>
+    </w:p>
+    <w:p>
+      <w:pPr>
+        <w:pStyle w:val="Heading1"/>
+      </w:pPr>
+      <w:r>
+        <w:t>Message architecture</w:t>
       </w:r>
     </w:p>
     <w:p>
@@ -40,12 +76,7 @@
         <w:pStyle w:val="ListBullet"/>
       </w:pPr>
       <w:r>
-        <w:rPr>
-          <w:b w:val="0"/>
-          <w:color w:val="334155"/>
-          <w:sz w:val="20"/>
-        </w:rPr>
-        <w:t>一句话说清服务对象、具体结果和交付方式。</w:t>
+        <w:t>Promise: move from scattered ideas to one visible operating plan.</w:t>
       </w:r>
     </w:p>
     <w:p>
@@ -53,22 +84,7 @@
         <w:pStyle w:val="ListBullet"/>
       </w:pPr>
       <w:r>
-        <w:rPr>
-          <w:b w:val="0"/>
-          <w:color w:val="334155"/>
-          <w:sz w:val="20"/>
-        </w:rPr>
-        <w:t>避免泛泛地写“帮你提升效率”，改成可感知的业务结果。</w:t>
-      </w:r>
-    </w:p>
-    <w:p>
-      <w:r>
-        <w:rPr>
-          <w:b/>
-          <w:color w:val="111827"/>
-          <w:sz w:val="30"/>
-        </w:rPr>
-        <w:t>页面结构</w:t>
+        <w:t>Proof: focused workshops, lightweight systems, and weekly decisions.</w:t>
       </w:r>
     </w:p>
     <w:p>
@@ -76,12 +92,511 @@
         <w:pStyle w:val="ListBullet"/>
       </w:pPr>
       <w:r>
+        <w:t>Voice: direct, warm, specific, and allergic to inflated claims.</w:t>
+      </w:r>
+    </w:p>
+    <w:p>
+      <w:r>
+        <w:br w:type="page"/>
+      </w:r>
+    </w:p>
+    <w:p>
+      <w:pPr>
+        <w:spacing w:after="320"/>
+        <w:pBdr>
+          <w:bottom w:val="single" w:sz="12" w:space="4" w:color="0F766E"/>
+        </w:pBdr>
+      </w:pPr>
+      <w:r>
         <w:rPr>
-          <w:b w:val="0"/>
-          <w:color w:val="334155"/>
-          <w:sz w:val="20"/>
+          <w:rFonts w:ascii="Arial" w:hAnsi="Arial"/>
+          <w:b/>
+          <w:color w:val="0F766E"/>
+          <w:sz w:val="18"/>
         </w:rPr>
-        <w:t>首屏 offer、服务套餐、案例证明、FAQ、预约入口。</w:t>
+        <w:t>HOMEPAGE / PRIMARY CONVERSION PATH</w:t>
+      </w:r>
+    </w:p>
+    <w:p>
+      <w:pPr>
+        <w:pStyle w:val="Heading1"/>
+      </w:pPr>
+      <w:r>
+        <w:t>Hero</w:t>
+      </w:r>
+    </w:p>
+    <w:p>
+      <w:r>
+        <w:rPr>
+          <w:b/>
+          <w:sz w:val="38"/>
+        </w:rPr>
+        <w:t>Turn messy work into a plan your week can actually follow.</w:t>
+      </w:r>
+    </w:p>
+    <w:p>
+      <w:r>
+        <w:t>I help independent operators simplify priorities, design lightweight workflows, and ship the next useful thing without losing the thread.</w:t>
+      </w:r>
+    </w:p>
+    <w:p>
+      <w:pPr>
+        <w:spacing w:before="140" w:after="260"/>
+        <w:ind w:left="259" w:right="259"/>
+        <w:shd w:fill="E8F5F2"/>
+      </w:pPr>
+      <w:r>
+        <w:rPr>
+          <w:rFonts w:ascii="Arial" w:hAnsi="Arial"/>
+          <w:b/>
+          <w:color w:val="0F766E"/>
+          <w:sz w:val="21"/>
+        </w:rPr>
+        <w:t xml:space="preserve">PRIMARY CTA  </w:t>
+      </w:r>
+      <w:r>
+        <w:rPr>
+          <w:rFonts w:ascii="Arial" w:hAnsi="Arial"/>
+          <w:sz w:val="21"/>
+        </w:rPr>
+        <w:t>Book a 30-minute operating diagnosis</w:t>
+      </w:r>
+    </w:p>
+    <w:p>
+      <w:pPr>
+        <w:pStyle w:val="Heading1"/>
+      </w:pPr>
+      <w:r>
+        <w:t>Services</w:t>
+      </w:r>
+    </w:p>
+    <w:tbl>
+      <w:tblPr>
+        <w:tblW w:type="dxa" w:w="9360"/>
+        <w:jc w:val="left"/>
+        <w:tblLayout w:type="fixed"/>
+        <w:tblLook w:firstColumn="1" w:firstRow="1" w:lastColumn="0" w:lastRow="0" w:noHBand="0" w:noVBand="1" w:val="04A0"/>
+      </w:tblPr>
+      <w:tblGrid>
+        <w:gridCol w:w="2200"/>
+        <w:gridCol w:w="2600"/>
+        <w:gridCol w:w="4560"/>
+      </w:tblGrid>
+      <w:tr>
+        <w:trPr>
+          <w:tblHeader w:val="true"/>
+        </w:trPr>
+        <w:tc>
+          <w:tcPr>
+            <w:tcW w:type="dxa" w:w="2200"/>
+            <w:tcMar>
+              <w:top w:w="100" w:type="dxa"/>
+              <w:start w:w="130" w:type="dxa"/>
+              <w:bottom w:w="100" w:type="dxa"/>
+              <w:end w:w="130" w:type="dxa"/>
+            </w:tcMar>
+            <w:vAlign w:val="center"/>
+            <w:shd w:fill="D7F0EB"/>
+          </w:tcPr>
+          <w:p>
+            <w:pPr>
+              <w:spacing w:after="0"/>
+            </w:pPr>
+            <w:r>
+              <w:rPr>
+                <w:rFonts w:ascii="Arial" w:hAnsi="Arial"/>
+                <w:b/>
+                <w:color w:val="0F766E"/>
+                <w:sz w:val="19"/>
+              </w:rPr>
+              <w:t>Offer</w:t>
+            </w:r>
+          </w:p>
+        </w:tc>
+        <w:tc>
+          <w:tcPr>
+            <w:tcW w:type="dxa" w:w="2600"/>
+            <w:tcMar>
+              <w:top w:w="100" w:type="dxa"/>
+              <w:start w:w="130" w:type="dxa"/>
+              <w:bottom w:w="100" w:type="dxa"/>
+              <w:end w:w="130" w:type="dxa"/>
+            </w:tcMar>
+            <w:vAlign w:val="center"/>
+            <w:shd w:fill="D7F0EB"/>
+          </w:tcPr>
+          <w:p>
+            <w:pPr>
+              <w:spacing w:after="0"/>
+            </w:pPr>
+            <w:r>
+              <w:rPr>
+                <w:rFonts w:ascii="Arial" w:hAnsi="Arial"/>
+                <w:b/>
+                <w:color w:val="0F766E"/>
+                <w:sz w:val="19"/>
+              </w:rPr>
+              <w:t>Best for</w:t>
+            </w:r>
+          </w:p>
+        </w:tc>
+        <w:tc>
+          <w:tcPr>
+            <w:tcW w:type="dxa" w:w="4560"/>
+            <w:tcMar>
+              <w:top w:w="100" w:type="dxa"/>
+              <w:start w:w="130" w:type="dxa"/>
+              <w:bottom w:w="100" w:type="dxa"/>
+              <w:end w:w="130" w:type="dxa"/>
+            </w:tcMar>
+            <w:vAlign w:val="center"/>
+            <w:shd w:fill="D7F0EB"/>
+          </w:tcPr>
+          <w:p>
+            <w:pPr>
+              <w:spacing w:after="0"/>
+            </w:pPr>
+            <w:r>
+              <w:rPr>
+                <w:rFonts w:ascii="Arial" w:hAnsi="Arial"/>
+                <w:b/>
+                <w:color w:val="0F766E"/>
+                <w:sz w:val="19"/>
+              </w:rPr>
+              <w:t>Outcome</w:t>
+            </w:r>
+          </w:p>
+        </w:tc>
+      </w:tr>
+      <w:tr>
+        <w:tc>
+          <w:tcPr>
+            <w:tcW w:type="dxa" w:w="2200"/>
+            <w:tcMar>
+              <w:top w:w="100" w:type="dxa"/>
+              <w:start w:w="130" w:type="dxa"/>
+              <w:bottom w:w="100" w:type="dxa"/>
+              <w:end w:w="130" w:type="dxa"/>
+            </w:tcMar>
+            <w:vAlign w:val="center"/>
+          </w:tcPr>
+          <w:p>
+            <w:pPr>
+              <w:spacing w:after="0"/>
+            </w:pPr>
+            <w:r>
+              <w:rPr>
+                <w:rFonts w:ascii="Arial" w:hAnsi="Arial"/>
+                <w:b w:val="0"/>
+                <w:color w:val="1F2937"/>
+                <w:sz w:val="19"/>
+              </w:rPr>
+              <w:t>Clarity Sprint</w:t>
+            </w:r>
+          </w:p>
+        </w:tc>
+        <w:tc>
+          <w:tcPr>
+            <w:tcW w:type="dxa" w:w="2600"/>
+            <w:tcMar>
+              <w:top w:w="100" w:type="dxa"/>
+              <w:start w:w="130" w:type="dxa"/>
+              <w:bottom w:w="100" w:type="dxa"/>
+              <w:end w:w="130" w:type="dxa"/>
+            </w:tcMar>
+            <w:vAlign w:val="center"/>
+          </w:tcPr>
+          <w:p>
+            <w:pPr>
+              <w:spacing w:after="0"/>
+            </w:pPr>
+            <w:r>
+              <w:rPr>
+                <w:rFonts w:ascii="Arial" w:hAnsi="Arial"/>
+                <w:b w:val="0"/>
+                <w:color w:val="1F2937"/>
+                <w:sz w:val="19"/>
+              </w:rPr>
+              <w:t>A stuck launch</w:t>
+            </w:r>
+          </w:p>
+        </w:tc>
+        <w:tc>
+          <w:tcPr>
+            <w:tcW w:type="dxa" w:w="4560"/>
+            <w:tcMar>
+              <w:top w:w="100" w:type="dxa"/>
+              <w:start w:w="130" w:type="dxa"/>
+              <w:bottom w:w="100" w:type="dxa"/>
+              <w:end w:w="130" w:type="dxa"/>
+            </w:tcMar>
+            <w:vAlign w:val="center"/>
+          </w:tcPr>
+          <w:p>
+            <w:pPr>
+              <w:spacing w:after="0"/>
+            </w:pPr>
+            <w:r>
+              <w:rPr>
+                <w:rFonts w:ascii="Arial" w:hAnsi="Arial"/>
+                <w:b w:val="0"/>
+                <w:color w:val="1F2937"/>
+                <w:sz w:val="19"/>
+              </w:rPr>
+              <w:t>One decision map</w:t>
+            </w:r>
+          </w:p>
+        </w:tc>
+      </w:tr>
+      <w:tr>
+        <w:tc>
+          <w:tcPr>
+            <w:tcW w:type="dxa" w:w="2200"/>
+            <w:tcMar>
+              <w:top w:w="100" w:type="dxa"/>
+              <w:start w:w="130" w:type="dxa"/>
+              <w:bottom w:w="100" w:type="dxa"/>
+              <w:end w:w="130" w:type="dxa"/>
+            </w:tcMar>
+            <w:vAlign w:val="center"/>
+          </w:tcPr>
+          <w:p>
+            <w:pPr>
+              <w:spacing w:after="0"/>
+            </w:pPr>
+            <w:r>
+              <w:rPr>
+                <w:rFonts w:ascii="Arial" w:hAnsi="Arial"/>
+                <w:b w:val="0"/>
+                <w:color w:val="1F2937"/>
+                <w:sz w:val="19"/>
+              </w:rPr>
+              <w:t>Workflow Reset</w:t>
+            </w:r>
+          </w:p>
+        </w:tc>
+        <w:tc>
+          <w:tcPr>
+            <w:tcW w:type="dxa" w:w="2600"/>
+            <w:tcMar>
+              <w:top w:w="100" w:type="dxa"/>
+              <w:start w:w="130" w:type="dxa"/>
+              <w:bottom w:w="100" w:type="dxa"/>
+              <w:end w:w="130" w:type="dxa"/>
+            </w:tcMar>
+            <w:vAlign w:val="center"/>
+          </w:tcPr>
+          <w:p>
+            <w:pPr>
+              <w:spacing w:after="0"/>
+            </w:pPr>
+            <w:r>
+              <w:rPr>
+                <w:rFonts w:ascii="Arial" w:hAnsi="Arial"/>
+                <w:b w:val="0"/>
+                <w:color w:val="1F2937"/>
+                <w:sz w:val="19"/>
+              </w:rPr>
+              <w:t>Recurring delivery</w:t>
+            </w:r>
+          </w:p>
+        </w:tc>
+        <w:tc>
+          <w:tcPr>
+            <w:tcW w:type="dxa" w:w="4560"/>
+            <w:tcMar>
+              <w:top w:w="100" w:type="dxa"/>
+              <w:start w:w="130" w:type="dxa"/>
+              <w:bottom w:w="100" w:type="dxa"/>
+              <w:end w:w="130" w:type="dxa"/>
+            </w:tcMar>
+            <w:vAlign w:val="center"/>
+          </w:tcPr>
+          <w:p>
+            <w:pPr>
+              <w:spacing w:after="0"/>
+            </w:pPr>
+            <w:r>
+              <w:rPr>
+                <w:rFonts w:ascii="Arial" w:hAnsi="Arial"/>
+                <w:b w:val="0"/>
+                <w:color w:val="1F2937"/>
+                <w:sz w:val="19"/>
+              </w:rPr>
+              <w:t>A calmer weekly system</w:t>
+            </w:r>
+          </w:p>
+        </w:tc>
+      </w:tr>
+      <w:tr>
+        <w:tc>
+          <w:tcPr>
+            <w:tcW w:type="dxa" w:w="2200"/>
+            <w:tcMar>
+              <w:top w:w="100" w:type="dxa"/>
+              <w:start w:w="130" w:type="dxa"/>
+              <w:bottom w:w="100" w:type="dxa"/>
+              <w:end w:w="130" w:type="dxa"/>
+            </w:tcMar>
+            <w:vAlign w:val="center"/>
+          </w:tcPr>
+          <w:p>
+            <w:pPr>
+              <w:spacing w:after="0"/>
+            </w:pPr>
+            <w:r>
+              <w:rPr>
+                <w:rFonts w:ascii="Arial" w:hAnsi="Arial"/>
+                <w:b w:val="0"/>
+                <w:color w:val="1F2937"/>
+                <w:sz w:val="19"/>
+              </w:rPr>
+              <w:t>Fractional Ops</w:t>
+            </w:r>
+          </w:p>
+        </w:tc>
+        <w:tc>
+          <w:tcPr>
+            <w:tcW w:type="dxa" w:w="2600"/>
+            <w:tcMar>
+              <w:top w:w="100" w:type="dxa"/>
+              <w:start w:w="130" w:type="dxa"/>
+              <w:bottom w:w="100" w:type="dxa"/>
+              <w:end w:w="130" w:type="dxa"/>
+            </w:tcMar>
+            <w:vAlign w:val="center"/>
+          </w:tcPr>
+          <w:p>
+            <w:pPr>
+              <w:spacing w:after="0"/>
+            </w:pPr>
+            <w:r>
+              <w:rPr>
+                <w:rFonts w:ascii="Arial" w:hAnsi="Arial"/>
+                <w:b w:val="0"/>
+                <w:color w:val="1F2937"/>
+                <w:sz w:val="19"/>
+              </w:rPr>
+              <w:t>Ongoing complexity</w:t>
+            </w:r>
+          </w:p>
+        </w:tc>
+        <w:tc>
+          <w:tcPr>
+            <w:tcW w:type="dxa" w:w="4560"/>
+            <w:tcMar>
+              <w:top w:w="100" w:type="dxa"/>
+              <w:start w:w="130" w:type="dxa"/>
+              <w:bottom w:w="100" w:type="dxa"/>
+              <w:end w:w="130" w:type="dxa"/>
+            </w:tcMar>
+            <w:vAlign w:val="center"/>
+          </w:tcPr>
+          <w:p>
+            <w:pPr>
+              <w:spacing w:after="0"/>
+            </w:pPr>
+            <w:r>
+              <w:rPr>
+                <w:rFonts w:ascii="Arial" w:hAnsi="Arial"/>
+                <w:b w:val="0"/>
+                <w:color w:val="1F2937"/>
+                <w:sz w:val="19"/>
+              </w:rPr>
+              <w:t>Decisions, cadence, follow-through</w:t>
+            </w:r>
+          </w:p>
+        </w:tc>
+      </w:tr>
+    </w:tbl>
+    <w:p>
+      <w:r>
+        <w:br w:type="page"/>
+      </w:r>
+    </w:p>
+    <w:p>
+      <w:pPr>
+        <w:spacing w:after="320"/>
+        <w:pBdr>
+          <w:bottom w:val="single" w:sz="12" w:space="4" w:color="0F766E"/>
+        </w:pBdr>
+      </w:pPr>
+      <w:r>
+        <w:rPr>
+          <w:rFonts w:ascii="Arial" w:hAnsi="Arial"/>
+          <w:b/>
+          <w:color w:val="0F766E"/>
+          <w:sz w:val="18"/>
+        </w:rPr>
+        <w:t>TRUST / OBJECTIONS / VOICE</w:t>
+      </w:r>
+    </w:p>
+    <w:p>
+      <w:pPr>
+        <w:pStyle w:val="Heading1"/>
+      </w:pPr>
+      <w:r>
+        <w:t>About</w:t>
+      </w:r>
+    </w:p>
+    <w:p>
+      <w:r>
+        <w:t>Good operations should make judgment easier. My work combines facilitation, systems thinking, and crisp writing so teams can see what matters and act on it.</w:t>
+      </w:r>
+    </w:p>
+    <w:p>
+      <w:pPr>
+        <w:pStyle w:val="Heading1"/>
+      </w:pPr>
+      <w:r>
+        <w:t>Frequently asked questions</w:t>
+      </w:r>
+    </w:p>
+    <w:p>
+      <w:pPr>
+        <w:pStyle w:val="Heading2"/>
+      </w:pPr>
+      <w:r>
+        <w:t>Do I need a new tool?</w:t>
+      </w:r>
+    </w:p>
+    <w:p>
+      <w:r>
+        <w:t>Usually not. We start with the tools and habits already in place.</w:t>
+      </w:r>
+    </w:p>
+    <w:p>
+      <w:pPr>
+        <w:pStyle w:val="Heading2"/>
+      </w:pPr>
+      <w:r>
+        <w:t>How quickly will I see a result?</w:t>
+      </w:r>
+    </w:p>
+    <w:p>
+      <w:r>
+        <w:t>Every engagement produces a usable decision or operating artifact in the first week.</w:t>
+      </w:r>
+    </w:p>
+    <w:p>
+      <w:pPr>
+        <w:pStyle w:val="Heading2"/>
+      </w:pPr>
+      <w:r>
+        <w:t>Is this coaching?</w:t>
+      </w:r>
+    </w:p>
+    <w:p>
+      <w:r>
+        <w:t>It is hands-on operating design: we make the plan and build the working system together.</w:t>
+      </w:r>
+    </w:p>
+    <w:p>
+      <w:pPr>
+        <w:pStyle w:val="Heading1"/>
+      </w:pPr>
+      <w:r>
+        <w:t>Voice guardrails</w:t>
       </w:r>
     </w:p>
     <w:p>
@@ -89,225 +604,86 @@
         <w:pStyle w:val="ListBullet"/>
       </w:pPr>
       <w:r>
-        <w:rPr>
-          <w:b w:val="0"/>
-          <w:color w:val="334155"/>
-          <w:sz w:val="20"/>
-        </w:rPr>
-        <w:t>每个模块都配一条可直接使用的文案。</w:t>
+        <w:t>Prefer concrete verbs over abstract transformation language.</w:t>
       </w:r>
     </w:p>
-    <w:tbl>
-      <w:tblPr>
-        <w:tblStyle w:val="TableGrid"/>
-        <w:tblW w:type="auto" w:w="0"/>
-        <w:tblLook w:firstColumn="1" w:firstRow="1" w:lastColumn="0" w:lastRow="0" w:noHBand="0" w:noVBand="1" w:val="04A0"/>
-      </w:tblPr>
-      <w:tblGrid>
-        <w:gridCol w:w="3312"/>
-        <w:gridCol w:w="3312"/>
-        <w:gridCol w:w="3312"/>
-      </w:tblGrid>
-      <w:tr>
-        <w:tc>
-          <w:tcPr>
-            <w:tcW w:type="dxa" w:w="3312"/>
-            <w:shd w:fill="0F766E"/>
-          </w:tcPr>
-          <w:p>
-            <w:r>
-              <w:rPr>
-                <w:b/>
-                <w:color w:val="FFFFFF"/>
-                <w:sz w:val="18"/>
-              </w:rPr>
-              <w:t>模块</w:t>
-            </w:r>
-          </w:p>
-        </w:tc>
-        <w:tc>
-          <w:tcPr>
-            <w:tcW w:type="dxa" w:w="3312"/>
-            <w:shd w:fill="0F766E"/>
-          </w:tcPr>
-          <w:p>
-            <w:r>
-              <w:rPr>
-                <w:b/>
-                <w:color w:val="FFFFFF"/>
-                <w:sz w:val="18"/>
-              </w:rPr>
-              <w:t>用途</w:t>
-            </w:r>
-          </w:p>
-        </w:tc>
-        <w:tc>
-          <w:tcPr>
-            <w:tcW w:type="dxa" w:w="3312"/>
-            <w:shd w:fill="0F766E"/>
-          </w:tcPr>
-          <w:p>
-            <w:r>
-              <w:rPr>
-                <w:b/>
-                <w:color w:val="FFFFFF"/>
-                <w:sz w:val="18"/>
-              </w:rPr>
-              <w:t>示例</w:t>
-            </w:r>
-          </w:p>
-        </w:tc>
-      </w:tr>
-      <w:tr>
-        <w:tc>
-          <w:tcPr>
-            <w:tcW w:type="dxa" w:w="3312"/>
-          </w:tcPr>
-          <w:p>
-            <w:r>
-              <w:rPr>
-                <w:b w:val="0"/>
-                <w:color w:val="334155"/>
-                <w:sz w:val="18"/>
-              </w:rPr>
-              <w:t>Hero</w:t>
-            </w:r>
-          </w:p>
-        </w:tc>
-        <w:tc>
-          <w:tcPr>
-            <w:tcW w:type="dxa" w:w="3312"/>
-          </w:tcPr>
-          <w:p>
-            <w:r>
-              <w:rPr>
-                <w:b w:val="0"/>
-                <w:color w:val="334155"/>
-                <w:sz w:val="18"/>
-              </w:rPr>
-              <w:t>第一屏转化</w:t>
-            </w:r>
-          </w:p>
-        </w:tc>
-        <w:tc>
-          <w:tcPr>
-            <w:tcW w:type="dxa" w:w="3312"/>
-          </w:tcPr>
-          <w:p>
-            <w:r>
-              <w:rPr>
-                <w:b w:val="0"/>
-                <w:color w:val="334155"/>
-                <w:sz w:val="18"/>
-              </w:rPr>
-              <w:t>把重复运营流程交给 AI 系统</w:t>
-            </w:r>
-          </w:p>
-        </w:tc>
-      </w:tr>
-      <w:tr>
-        <w:tc>
-          <w:tcPr>
-            <w:tcW w:type="dxa" w:w="3312"/>
-          </w:tcPr>
-          <w:p>
-            <w:r>
-              <w:rPr>
-                <w:b w:val="0"/>
-                <w:color w:val="334155"/>
-                <w:sz w:val="18"/>
-              </w:rPr>
-              <w:t>Offer</w:t>
-            </w:r>
-          </w:p>
-        </w:tc>
-        <w:tc>
-          <w:tcPr>
-            <w:tcW w:type="dxa" w:w="3312"/>
-          </w:tcPr>
-          <w:p>
-            <w:r>
-              <w:rPr>
-                <w:b w:val="0"/>
-                <w:color w:val="334155"/>
-                <w:sz w:val="18"/>
-              </w:rPr>
-              <w:t>服务包装</w:t>
-            </w:r>
-          </w:p>
-        </w:tc>
-        <w:tc>
-          <w:tcPr>
-            <w:tcW w:type="dxa" w:w="3312"/>
-          </w:tcPr>
-          <w:p>
-            <w:r>
-              <w:rPr>
-                <w:b w:val="0"/>
-                <w:color w:val="334155"/>
-                <w:sz w:val="18"/>
-              </w:rPr>
-              <w:t>7 天流程诊断 + 自动化搭建</w:t>
-            </w:r>
-          </w:p>
-        </w:tc>
-      </w:tr>
-      <w:tr>
-        <w:tc>
-          <w:tcPr>
-            <w:tcW w:type="dxa" w:w="3312"/>
-          </w:tcPr>
-          <w:p>
-            <w:r>
-              <w:rPr>
-                <w:b w:val="0"/>
-                <w:color w:val="334155"/>
-                <w:sz w:val="18"/>
-              </w:rPr>
-              <w:t>CTA</w:t>
-            </w:r>
-          </w:p>
-        </w:tc>
-        <w:tc>
-          <w:tcPr>
-            <w:tcW w:type="dxa" w:w="3312"/>
-          </w:tcPr>
-          <w:p>
-            <w:r>
-              <w:rPr>
-                <w:b w:val="0"/>
-                <w:color w:val="334155"/>
-                <w:sz w:val="18"/>
-              </w:rPr>
-              <w:t>预约</w:t>
-            </w:r>
-          </w:p>
-        </w:tc>
-        <w:tc>
-          <w:tcPr>
-            <w:tcW w:type="dxa" w:w="3312"/>
-          </w:tcPr>
-          <w:p>
-            <w:r>
-              <w:rPr>
-                <w:b w:val="0"/>
-                <w:color w:val="334155"/>
-                <w:sz w:val="18"/>
-              </w:rPr>
-              <w:t>发来你的流程截图</w:t>
-            </w:r>
-          </w:p>
-        </w:tc>
-      </w:tr>
-    </w:tbl>
+    <w:p>
+      <w:pPr>
+        <w:pStyle w:val="ListBullet"/>
+      </w:pPr>
+      <w:r>
+        <w:t>Name the tradeoff instead of promising effortless results.</w:t>
+      </w:r>
+    </w:p>
+    <w:p>
+      <w:pPr>
+        <w:pStyle w:val="ListBullet"/>
+      </w:pPr>
+      <w:r>
+        <w:t>End each page with one obvious next action.</w:t>
+      </w:r>
+    </w:p>
     <w:sectPr>
+      <w:headerReference w:type="default" r:id="rId9"/>
+      <w:footerReference w:type="default" r:id="rId10"/>
       <w:pgSz w:w="12240" w:h="15840"/>
-      <w:pgMar w:top="1080" w:right="1152" w:bottom="1080" w:left="1152" w:header="720" w:footer="720" w:gutter="0"/>
+      <w:pgMar w:top="1152" w:right="1224" w:bottom="1152" w:left="1224" w:header="720" w:footer="720" w:gutter="0"/>
       <w:cols w:space="720"/>
       <w:docGrid w:linePitch="360"/>
     </w:sectPr>
   </w:body>
 </w:document>
+</file>
+
+<file path=word/footer1.xml><?xml version="1.0" encoding="utf-8"?>
+<w:ftr xmlns:m="http://schemas.openxmlformats.org/officeDocument/2006/math" xmlns:mc="http://schemas.openxmlformats.org/markup-compatibility/2006" xmlns:mo="http://schemas.microsoft.com/office/mac/office/2008/main" xmlns:mv="urn:schemas-microsoft-com:mac:vml" xmlns:o="urn:schemas-microsoft-com:office:office" xmlns:r="http://schemas.openxmlformats.org/officeDocument/2006/relationships" xmlns:v="urn:schemas-microsoft-com:vml" xmlns:w10="urn:schemas-microsoft-com:office:word" xmlns:w14="http://schemas.microsoft.com/office/word/2010/wordml" xmlns:w="http://schemas.openxmlformats.org/wordprocessingml/2006/main" xmlns:wne="http://schemas.microsoft.com/office/word/2006/wordml" xmlns:wp14="http://schemas.microsoft.com/office/word/2010/wordprocessingDrawing" xmlns:wp="http://schemas.openxmlformats.org/drawingml/2006/wordprocessingDrawing" xmlns:wpc="http://schemas.microsoft.com/office/word/2010/wordprocessingCanvas" xmlns:wpg="http://schemas.microsoft.com/office/word/2010/wordprocessingGroup" xmlns:wpi="http://schemas.microsoft.com/office/word/2010/wordprocessingInk" xmlns:wps="http://schemas.microsoft.com/office/word/2010/wordprocessingShape" mc:Ignorable="w14 wp14">
+  <w:p>
+    <w:pPr>
+      <w:pStyle w:val="Footer"/>
+      <w:jc w:val="right"/>
+    </w:pPr>
+    <w:r>
+      <w:rPr>
+        <w:rFonts w:ascii="Arial" w:hAnsi="Arial"/>
+        <w:color w:val="64748B"/>
+        <w:sz w:val="16"/>
+      </w:rPr>
+      <w:t xml:space="preserve">PAGE </w:t>
+    </w:r>
+    <w:r>
+      <w:rPr>
+        <w:rFonts w:ascii="Arial" w:hAnsi="Arial"/>
+        <w:color w:val="64748B"/>
+        <w:sz w:val="16"/>
+      </w:rPr>
+      <w:fldChar w:fldCharType="begin"/>
+      <w:instrText xml:space="preserve"> PAGE </w:instrText>
+      <w:fldChar w:fldCharType="separate"/>
+      <w:t>1</w:t>
+      <w:fldChar w:fldCharType="end"/>
+    </w:r>
+  </w:p>
+</w:ftr>
+</file>
+
+<file path=word/header1.xml><?xml version="1.0" encoding="utf-8"?>
+<w:hdr xmlns:m="http://schemas.openxmlformats.org/officeDocument/2006/math" xmlns:mc="http://schemas.openxmlformats.org/markup-compatibility/2006" xmlns:mo="http://schemas.microsoft.com/office/mac/office/2008/main" xmlns:mv="urn:schemas-microsoft-com:mac:vml" xmlns:o="urn:schemas-microsoft-com:office:office" xmlns:r="http://schemas.openxmlformats.org/officeDocument/2006/relationships" xmlns:v="urn:schemas-microsoft-com:vml" xmlns:w10="urn:schemas-microsoft-com:office:word" xmlns:w14="http://schemas.microsoft.com/office/word/2010/wordml" xmlns:w="http://schemas.openxmlformats.org/wordprocessingml/2006/main" xmlns:wne="http://schemas.microsoft.com/office/word/2006/wordml" xmlns:wp14="http://schemas.microsoft.com/office/word/2010/wordprocessingDrawing" xmlns:wp="http://schemas.openxmlformats.org/drawingml/2006/wordprocessingDrawing" xmlns:wpc="http://schemas.microsoft.com/office/word/2010/wordprocessingCanvas" xmlns:wpg="http://schemas.microsoft.com/office/word/2010/wordprocessingGroup" xmlns:wpi="http://schemas.microsoft.com/office/word/2010/wordprocessingInk" xmlns:wps="http://schemas.microsoft.com/office/word/2010/wordprocessingShape" mc:Ignorable="w14 wp14">
+  <w:p>
+    <w:pPr>
+      <w:pStyle w:val="Header"/>
+      <w:jc w:val="right"/>
+    </w:pPr>
+    <w:r>
+      <w:rPr>
+        <w:rFonts w:ascii="Arial" w:hAnsi="Arial"/>
+        <w:b/>
+        <w:color w:val="64748B"/>
+        <w:sz w:val="16"/>
+      </w:rPr>
+      <w:t>PERSONAL COMPANY COPY PACK</w:t>
+    </w:r>
+  </w:p>
+</w:hdr>
 </file>
 
 <file path=word/numbering.xml><?xml version="1.0" encoding="utf-8"?>
@@ -673,8 +1049,14 @@
     <w:name w:val="Normal"/>
     <w:qFormat/>
     <w:rsid w:val="00FC693F"/>
+    <w:pPr>
+      <w:widowControl/>
+      <w:spacing w:line="300" w:lineRule="exact" w:after="140"/>
+    </w:pPr>
     <w:rPr>
-      <w:rFonts w:ascii="Arial" w:hAnsi="Arial"/>
+      <w:rFonts w:ascii="Arial" w:hAnsi="Arial" w:eastAsia="Arial"/>
+      <w:b w:val="0"/>
+      <w:color w:val="1F2937"/>
       <w:sz w:val="21"/>
     </w:rPr>
   </w:style>
@@ -733,15 +1115,15 @@
     <w:pPr>
       <w:keepNext/>
       <w:keepLines/>
-      <w:spacing w:before="480" w:after="0"/>
+      <w:spacing w:before="360" w:after="140"/>
       <w:outlineLvl w:val="0"/>
     </w:pPr>
     <w:rPr>
-      <w:rFonts w:asciiTheme="majorHAnsi" w:eastAsiaTheme="majorEastAsia" w:hAnsiTheme="majorHAnsi" w:cstheme="majorBidi"/>
+      <w:rFonts w:asciiTheme="majorHAnsi" w:eastAsiaTheme="majorEastAsia" w:hAnsiTheme="majorHAnsi" w:cstheme="majorBidi" w:ascii="Arial" w:hAnsi="Arial" w:eastAsia="Arial"/>
       <w:b/>
       <w:bCs/>
-      <w:color w:val="365F91" w:themeColor="accent1" w:themeShade="BF"/>
-      <w:sz w:val="28"/>
+      <w:color w:val="0F766E"/>
+      <w:sz w:val="36"/>
       <w:szCs w:val="28"/>
     </w:rPr>
   </w:style>
@@ -757,15 +1139,15 @@
     <w:pPr>
       <w:keepNext/>
       <w:keepLines/>
-      <w:spacing w:before="200" w:after="0"/>
+      <w:spacing w:before="240" w:after="100"/>
       <w:outlineLvl w:val="1"/>
     </w:pPr>
     <w:rPr>
-      <w:rFonts w:asciiTheme="majorHAnsi" w:eastAsiaTheme="majorEastAsia" w:hAnsiTheme="majorHAnsi" w:cstheme="majorBidi"/>
+      <w:rFonts w:asciiTheme="majorHAnsi" w:eastAsiaTheme="majorEastAsia" w:hAnsiTheme="majorHAnsi" w:cstheme="majorBidi" w:ascii="Arial" w:hAnsi="Arial" w:eastAsia="Arial"/>
       <w:b/>
       <w:bCs/>
-      <w:color w:val="4F81BD" w:themeColor="accent1"/>
-      <w:sz w:val="26"/>
+      <w:color w:val="1F2937"/>
+      <w:sz w:val="25"/>
       <w:szCs w:val="26"/>
     </w:rPr>
   </w:style>
@@ -781,14 +1163,15 @@
     <w:pPr>
       <w:keepNext/>
       <w:keepLines/>
-      <w:spacing w:before="200" w:after="0"/>
+      <w:spacing w:before="180" w:after="80"/>
       <w:outlineLvl w:val="2"/>
     </w:pPr>
     <w:rPr>
-      <w:rFonts w:asciiTheme="majorHAnsi" w:eastAsiaTheme="majorEastAsia" w:hAnsiTheme="majorHAnsi" w:cstheme="majorBidi"/>
+      <w:rFonts w:asciiTheme="majorHAnsi" w:eastAsiaTheme="majorEastAsia" w:hAnsiTheme="majorHAnsi" w:cstheme="majorBidi" w:ascii="Arial" w:hAnsi="Arial" w:eastAsia="Arial"/>
       <w:b/>
       <w:bCs/>
-      <w:color w:val="4F81BD" w:themeColor="accent1"/>
+      <w:color w:val="0F766E"/>
+      <w:sz w:val="21"/>
     </w:rPr>
   </w:style>
   <w:style w:type="paragraph" w:styleId="Heading4">
@@ -1019,18 +1402,17 @@
     <w:qFormat/>
     <w:rsid w:val="00FC693F"/>
     <w:pPr>
-      <w:pBdr>
-        <w:bottom w:val="single" w:sz="8" w:space="4" w:color="4F81BD" w:themeColor="accent1"/>
-      </w:pBdr>
-      <w:spacing w:after="300" w:line="240" w:lineRule="auto"/>
+      <w:keepNext/>
+      <w:spacing w:after="200" w:line="240" w:lineRule="auto" w:before="0"/>
       <w:contextualSpacing/>
     </w:pPr>
     <w:rPr>
-      <w:rFonts w:asciiTheme="majorHAnsi" w:eastAsiaTheme="majorEastAsia" w:hAnsiTheme="majorHAnsi" w:cstheme="majorBidi"/>
-      <w:color w:val="17365D" w:themeColor="text2" w:themeShade="BF"/>
+      <w:rFonts w:asciiTheme="majorHAnsi" w:eastAsiaTheme="majorEastAsia" w:hAnsiTheme="majorHAnsi" w:cstheme="majorBidi" w:ascii="Arial" w:hAnsi="Arial" w:eastAsia="Arial"/>
+      <w:b/>
+      <w:color w:val="1F2937"/>
       <w:spacing w:val="5"/>
       <w:kern w:val="28"/>
-      <w:sz w:val="52"/>
+      <w:sz w:val="62"/>
       <w:szCs w:val="52"/>
     </w:rPr>
   </w:style>
@@ -1204,8 +1586,15 @@
       <w:numPr>
         <w:numId w:val="1"/>
       </w:numPr>
+      <w:spacing w:after="60"/>
       <w:contextualSpacing/>
     </w:pPr>
+    <w:rPr>
+      <w:rFonts w:ascii="Arial" w:hAnsi="Arial" w:eastAsia="Arial"/>
+      <w:b w:val="0"/>
+      <w:color w:val="1F2937"/>
+      <w:sz w:val="21"/>
+    </w:rPr>
   </w:style>
   <w:style w:type="paragraph" w:styleId="ListBullet2">
     <w:name w:val="List Bullet 2"/>
@@ -1243,8 +1632,15 @@
       <w:numPr>
         <w:numId w:val="5"/>
       </w:numPr>
+      <w:spacing w:after="60"/>
       <w:contextualSpacing/>
     </w:pPr>
+    <w:rPr>
+      <w:rFonts w:ascii="Arial" w:hAnsi="Arial" w:eastAsia="Arial"/>
+      <w:b w:val="0"/>
+      <w:color w:val="1F2937"/>
+      <w:sz w:val="21"/>
+    </w:rPr>
   </w:style>
   <w:style w:type="paragraph" w:styleId="ListNumber2">
     <w:name w:val="List Number 2"/>

</xml_diff>